<commit_message>
Ažuriraj raspored gostiju za stolove
</commit_message>
<xml_diff>
--- a/stolovipopis/Stol 17.docx
+++ b/stolovipopis/Stol 17.docx
@@ -157,20 +157,7 @@
         </w:rPr>
       </w:pPr>
       <w:r>
-        <w:rPr>
-          <w:sz w:val="40"/>
-          <w:szCs w:val="40"/>
-          <w:lang w:val="hr-BA"/>
-        </w:rPr>
-        <w:t>Paradžiković</w:t>
-      </w:r>
-      <w:r>
-        <w:rPr>
-          <w:sz w:val="40"/>
-          <w:szCs w:val="40"/>
-          <w:lang w:val="hr-BA"/>
-        </w:rPr>
-        <w:t xml:space="preserve"> Luca</w:t>
+        <w:t>Jerković Niko</w:t>
       </w:r>
     </w:p>
     <w:p>

</xml_diff>